<commit_message>
Set the ActiveState end date to Apr 2026 and drop the false concurrency line
Two changes, both following from the ActiveState role ending in April 2026.

The header now reads Jul 2025 - Apr 2026 rather than Jul 2025 - Present.

The Caldermont subtitle claimed the engagement was concurrent with
ActiveState. That was true while ActiveState ran to Present, and it became
false the moment the end date moved to April: Caldermont starts Aug 2026,
four months after ActiveState ended, so the two never overlapped. A reader
would have hit a direct self-contradiction between that line and the date on
the header two entries below it. The claim is removed and the rest of the
subtitle stands.

997 words. Measured at 1343pt against 1440pt of two-page area. XSD
validation passed, 65 paragraphs unchanged. Zero em dashes.

Co-Authored-By: Claude Opus 5 <noreply@anthropic.com>
Claude-Session: https://claude.ai/code/session_01H5DNxWVS3F4ttMgtz1ovfM
</commit_message>
<xml_diff>
--- a/Bob/Robert_Shaker_II_Resume.docx
+++ b/Bob/Robert_Shaker_II_Resume.docx
@@ -352,7 +352,7 @@
           <w:szCs w:val="17"/>
           <w:rtl w:val="0"/>
         </w:rPr>
-        <w:t xml:space="preserve">Fractional </w:t>
+        <w:t xml:space="preserve">Fractional leadership engagements, management transformation, and AI enablement.</w:t>
       </w:r>
       <w:r>
         <w:rPr>
@@ -362,7 +362,7 @@
           <w:szCs w:val="17"/>
           <w:rtl w:val="0"/>
         </w:rPr>
-        <w:t xml:space="preserve">leadership </w:t>
+        <w:t xml:space="preserve"/>
       </w:r>
       <w:r>
         <w:rPr>
@@ -377,7 +377,7 @@
           <w:szCs w:val="17"/>
           <w:rtl w:val="0"/>
         </w:rPr>
-        <w:t xml:space="preserve">engagements, management transformation, and AI enablement. Concurrent with ActiveState.</w:t>
+        <w:t xml:space="preserve"/>
       </w:r>
       <w:r>
         <w:rPr>
@@ -527,7 +527,7 @@
           <w:szCs w:val="18"/>
           <w:rtl w:val="0"/>
         </w:rPr>
-        <w:t xml:space="preserve">Jul 2025 – Present</w:t>
+        <w:t xml:space="preserve">Jul 2025 – Apr 2026</w:t>
       </w:r>
       <w:r>
         <w:rPr>

</xml_diff>